<commit_message>
jeg fikset en feil som gjordte at man ikke fikk lånt utstyr
</commit_message>
<xml_diff>
--- a/plandokumenter.docx
+++ b/plandokumenter.docx
@@ -95,15 +95,7 @@
         <w:ind w:left="360"/>
       </w:pPr>
       <w:r>
-        <w:t xml:space="preserve">må </w:t>
-      </w:r>
-      <w:proofErr w:type="gramStart"/>
-      <w:r>
-        <w:t>fokusere</w:t>
-      </w:r>
-      <w:proofErr w:type="gramEnd"/>
-      <w:r>
-        <w:t xml:space="preserve"> på</w:t>
+        <w:t>må fokusere på</w:t>
       </w:r>
       <w:r>
         <w:t>:</w:t>
@@ -134,6 +126,14 @@
         <w:t>JS</w:t>
       </w:r>
       <w:proofErr w:type="spellEnd"/>
+    </w:p>
+    <w:p>
+      <w:pPr>
+        <w:ind w:left="360"/>
+      </w:pPr>
+      <w:r>
+        <w:t>SQL</w:t>
+      </w:r>
     </w:p>
     <w:p>
       <w:r>
@@ -184,20 +184,16 @@
     <w:p/>
     <w:p>
       <w:r>
-        <w:lastRenderedPageBreak/>
         <w:t>4. juni så gjør jeg ferdig alt av planlegging som for eksempel blir å lage en fremvisning av hvordan databasen kommer til å fungere og hva den består av</w:t>
       </w:r>
       <w:r>
         <w:t xml:space="preserve"> og sette opp alle dokumenter med forklaring og planer for oppgaven</w:t>
       </w:r>
       <w:r>
-        <w:t xml:space="preserve">. Etter dette lager jeg grund koden for programmet som </w:t>
-      </w:r>
-      <w:r>
-        <w:t xml:space="preserve">består av JavaScript for funksjonalitet og html og CSS for brukervenderlighet. </w:t>
-      </w:r>
-      <w:r>
-        <w:t xml:space="preserve">jeg skal sette opp en klar </w:t>
+        <w:t xml:space="preserve">. </w:t>
+      </w:r>
+      <w:r>
+        <w:t xml:space="preserve">Jeg begynner også litt med videre programmering av nettsiden, jeg skal </w:t>
       </w:r>
     </w:p>
     <w:p/>

</xml_diff>

<commit_message>
jeg la inn en klokke som viser hvor lenge noe har vært ulånt og jeg har lagt inn masse komentarer som forklarer koden
</commit_message>
<xml_diff>
--- a/plandokumenter.docx
+++ b/plandokumenter.docx
@@ -176,29 +176,112 @@
     <w:p/>
     <w:p/>
     <w:p/>
-    <w:p>
-      <w:r>
+    <w:p/>
+    <w:p>
+      <w:r>
+        <w:lastRenderedPageBreak/>
         <w:t xml:space="preserve">Handlings plan </w:t>
       </w:r>
     </w:p>
     <w:p/>
     <w:p>
       <w:r>
-        <w:t>4. juni så gjør jeg ferdig alt av planlegging som for eksempel blir å lage en fremvisning av hvordan databasen kommer til å fungere og hva den består av</w:t>
-      </w:r>
-      <w:r>
-        <w:t xml:space="preserve"> og sette opp alle dokumenter med forklaring og planer for oppgaven</w:t>
-      </w:r>
-      <w:r>
-        <w:t xml:space="preserve">. </w:t>
-      </w:r>
-      <w:r>
-        <w:t xml:space="preserve">Jeg begynner også litt med videre programmering av nettsiden, jeg skal </w:t>
-      </w:r>
-      <w:r>
-        <w:t>legge inn muligheten til å se hvem som har lånt hva og når det ble lånt.</w:t>
-      </w:r>
-    </w:p>
+        <w:t>Den 4. juni skal jeg ferdigstille hele planleggingsdelen av prosjektet. Dette innebærer blant annet å lage en tydelig og oversiktlig presentasjon som viser hvordan databasen er tenkt å fungere, hvilke deler den består av, og hvordan de ulike komponentene henger sammen. Jeg vil også strukturere og ferdigstille alle nødvendige dokumenter, der jeg forklarer valgene som er tatt underveis og legger fram en helhetlig plan for hvordan oppgaven skal gjennomføres.</w:t>
+      </w:r>
+    </w:p>
+    <w:p/>
+    <w:p>
+      <w:r>
+        <w:t>I tillegg planlegger jeg å begynne videre arbeid med programmeringen av nettsiden. Her vil jeg fokusere på å utvikle funksjonalitet som gjør det mulig å registrere og vise informasjon om utlån, slik at man enkelt kan se hvem som har lånt hva, samt tidspunktet for når utlånet ble registrert. Dette vil bidra til å gjøre systemet mer oversiktlig, brukervennlig og praktisk i bruk.</w:t>
+      </w:r>
+    </w:p>
+    <w:p/>
+    <w:p/>
+    <w:p/>
+    <w:p>
+      <w:r>
+        <w:t>Drift:</w:t>
+      </w:r>
+    </w:p>
+    <w:p>
+      <w:r>
+        <w:tab/>
+        <w:t>Produksjonsmiljø:</w:t>
+      </w:r>
+    </w:p>
+    <w:p>
+      <w:r>
+        <w:tab/>
+      </w:r>
+      <w:r>
+        <w:tab/>
+        <w:t>Fungerende applikasjon</w:t>
+      </w:r>
+    </w:p>
+    <w:p>
+      <w:r>
+        <w:tab/>
+      </w:r>
+      <w:proofErr w:type="spellStart"/>
+      <w:r>
+        <w:t>Dev</w:t>
+      </w:r>
+      <w:proofErr w:type="spellEnd"/>
+      <w:r>
+        <w:t>. Miljø:</w:t>
+      </w:r>
+    </w:p>
+    <w:p>
+      <w:r>
+        <w:tab/>
+      </w:r>
+      <w:r>
+        <w:tab/>
+        <w:t>Utviklermiljø / test</w:t>
+      </w:r>
+    </w:p>
+    <w:p/>
+    <w:p>
+      <w:r>
+        <w:t>Sikkerhet:</w:t>
+      </w:r>
+    </w:p>
+    <w:p>
+      <w:pPr>
+        <w:ind w:firstLine="708"/>
+      </w:pPr>
+      <w:r>
+        <w:t>Trusler:</w:t>
+      </w:r>
+    </w:p>
+    <w:p>
+      <w:pPr>
+        <w:ind w:firstLine="708"/>
+      </w:pPr>
+      <w:r>
+        <w:t>Personvern:</w:t>
+      </w:r>
+    </w:p>
+    <w:p>
+      <w:pPr>
+        <w:ind w:firstLine="708"/>
+      </w:pPr>
+      <w:r>
+        <w:t>Løsning:</w:t>
+      </w:r>
+    </w:p>
+    <w:p/>
+    <w:p>
+      <w:r>
+        <w:t>Brukerstøtte:</w:t>
+      </w:r>
+    </w:p>
+    <w:p>
+      <w:r>
+        <w:tab/>
+      </w:r>
+    </w:p>
+    <w:p/>
     <w:p/>
     <w:sectPr>
       <w:pgSz w:w="11906" w:h="16838"/>

</xml_diff>

<commit_message>
jeg fikk lagt inn admin og bruker roller i databasen så nå kan kunn admin legge inn nytt utstyr.
</commit_message>
<xml_diff>
--- a/plandokumenter.docx
+++ b/plandokumenter.docx
@@ -200,88 +200,71 @@
     <w:p/>
     <w:p>
       <w:r>
-        <w:t>Drift:</w:t>
-      </w:r>
-    </w:p>
-    <w:p>
-      <w:r>
-        <w:tab/>
-        <w:t>Produksjonsmiljø:</w:t>
-      </w:r>
-    </w:p>
-    <w:p>
-      <w:r>
-        <w:tab/>
-      </w:r>
-      <w:r>
-        <w:tab/>
-        <w:t>Fungerende applikasjon</w:t>
-      </w:r>
-    </w:p>
-    <w:p>
-      <w:r>
-        <w:tab/>
+        <w:t xml:space="preserve">Den 5. juni </w:t>
+      </w:r>
+      <w:r>
+        <w:t xml:space="preserve">har jobbet med å ferdig stille databasen, jeg la til at den sier hvor lenge det er siden noen har lånt ett utstyr med en fungerende klokke på det. La også inn en mørk </w:t>
+      </w:r>
+      <w:r>
+        <w:t>o</w:t>
+      </w:r>
+      <w:r>
+        <w:t xml:space="preserve">g lys modus knapp. </w:t>
+      </w:r>
+      <w:r>
+        <w:t>Jeg jobber også med å ferdig stille alle plan dokumenter</w:t>
+      </w:r>
+      <w:r>
+        <w:t xml:space="preserve">. </w:t>
+      </w:r>
+    </w:p>
+    <w:p/>
+    <w:p/>
+    <w:p/>
+    <w:p>
+      <w:r>
+        <w:t xml:space="preserve">Refleksjon </w:t>
+      </w:r>
+    </w:p>
+    <w:p/>
+    <w:p>
+      <w:r>
+        <w:t>Jeg ser underveis i utviklingen at hvis dette produktet skulle kunne benyttes i et firma eller skole måtte man bygget mer sikkerhet inn fra start.</w:t>
+      </w:r>
+    </w:p>
+    <w:p>
+      <w:r>
+        <w:t>Dette fordi jeg ser at det er personlig informasjon som lett kan komme på avveie, da det er for enkelt å logge inn i systemet.</w:t>
+      </w:r>
+    </w:p>
+    <w:p>
+      <w:r>
+        <w:t>Dette gjør løsningen utsatt for hacking eller andre data innbrudd.</w:t>
+      </w:r>
+    </w:p>
+    <w:p>
+      <w:r>
+        <w:t xml:space="preserve">Det er heller ikke noen </w:t>
       </w:r>
       <w:proofErr w:type="spellStart"/>
       <w:r>
-        <w:t>Dev</w:t>
+        <w:t>backup</w:t>
       </w:r>
       <w:proofErr w:type="spellEnd"/>
       <w:r>
-        <w:t>. Miljø:</w:t>
-      </w:r>
-    </w:p>
-    <w:p>
-      <w:r>
-        <w:tab/>
-      </w:r>
-      <w:r>
-        <w:tab/>
-        <w:t>Utviklermiljø / test</w:t>
-      </w:r>
-    </w:p>
-    <w:p/>
-    <w:p>
-      <w:r>
-        <w:t>Sikkerhet:</w:t>
-      </w:r>
-    </w:p>
-    <w:p>
-      <w:pPr>
-        <w:ind w:firstLine="708"/>
-      </w:pPr>
-      <w:r>
-        <w:t>Trusler:</w:t>
-      </w:r>
-    </w:p>
-    <w:p>
-      <w:pPr>
-        <w:ind w:firstLine="708"/>
-      </w:pPr>
-      <w:r>
-        <w:t>Personvern:</w:t>
-      </w:r>
-    </w:p>
-    <w:p>
-      <w:pPr>
-        <w:ind w:firstLine="708"/>
-      </w:pPr>
-      <w:r>
-        <w:t>Løsning:</w:t>
-      </w:r>
-    </w:p>
-    <w:p/>
-    <w:p>
-      <w:r>
-        <w:t>Brukerstøtte:</w:t>
-      </w:r>
-    </w:p>
-    <w:p>
-      <w:r>
-        <w:tab/>
-      </w:r>
-    </w:p>
-    <w:p/>
+        <w:t xml:space="preserve"> funksjon av database i systemet i dag, noe som er kritisk i en drift situasjon. </w:t>
+      </w:r>
+    </w:p>
+    <w:p>
+      <w:r>
+        <w:t xml:space="preserve">Jeg ser at løsningen derfor burde vært integrert med for eksempel multifaktorautentifikasjon, bruke skolens data register, bank id eller Microsoft authenticator. Jeg tenker også at passord guidelines kunne vært strengere og ikke bare seks tegn i passordet. </w:t>
+      </w:r>
+    </w:p>
+    <w:p>
+      <w:r>
+        <w:t>Det kunne også vært en god ide om og sette opp varsling når utstyr lånes ut og leveres tilbake som en bekreftelse til bruker, eller eier av produktet.</w:t>
+      </w:r>
+    </w:p>
     <w:p/>
     <w:sectPr>
       <w:pgSz w:w="11906" w:h="16838"/>

</xml_diff>

<commit_message>
fiksa noen små ting
</commit_message>
<xml_diff>
--- a/plandokumenter.docx
+++ b/plandokumenter.docx
@@ -215,7 +215,22 @@
         <w:t>Jeg jobber også med å ferdig stille alle plan dokumenter</w:t>
       </w:r>
       <w:r>
-        <w:t xml:space="preserve">. </w:t>
+        <w:t>.</w:t>
+      </w:r>
+      <w:r>
+        <w:t xml:space="preserve"> </w:t>
+      </w:r>
+    </w:p>
+    <w:p/>
+    <w:p>
+      <w:r>
+        <w:t>Jeg skal</w:t>
+      </w:r>
+      <w:r>
+        <w:t xml:space="preserve"> lage et er-ark av databasen min.</w:t>
+      </w:r>
+      <w:r>
+        <w:t xml:space="preserve"> </w:t>
       </w:r>
     </w:p>
     <w:p/>
@@ -244,15 +259,7 @@
     </w:p>
     <w:p>
       <w:r>
-        <w:t xml:space="preserve">Det er heller ikke noen </w:t>
-      </w:r>
-      <w:proofErr w:type="spellStart"/>
-      <w:r>
-        <w:t>backup</w:t>
-      </w:r>
-      <w:proofErr w:type="spellEnd"/>
-      <w:r>
-        <w:t xml:space="preserve"> funksjon av database i systemet i dag, noe som er kritisk i en drift situasjon. </w:t>
+        <w:t xml:space="preserve">Det er heller ikke noen backup funksjon av database i systemet i dag, noe som er kritisk i en drift situasjon. </w:t>
       </w:r>
     </w:p>
     <w:p>
@@ -264,8 +271,129 @@
       <w:r>
         <w:t>Det kunne også vært en god ide om og sette opp varsling når utstyr lånes ut og leveres tilbake som en bekreftelse til bruker, eller eier av produktet.</w:t>
       </w:r>
-    </w:p>
-    <w:p/>
+      <w:r>
+        <w:t xml:space="preserve"> </w:t>
+      </w:r>
+    </w:p>
+    <w:p/>
+    <w:p/>
+    <w:p/>
+    <w:p/>
+    <w:p/>
+    <w:p/>
+    <w:p/>
+    <w:p>
+      <w:r>
+        <w:lastRenderedPageBreak/>
+        <w:t>Forklarlig på hva jeg har brukt og hvorfor</w:t>
+      </w:r>
+    </w:p>
+    <w:p/>
+    <w:p/>
+    <w:p/>
+    <w:p>
+      <w:r>
+        <w:t>Supabase: supabase er en skytjeneste som er en fin måte å lage og drifte databaser. Grunnen til at jeg har brukt denne tjenesten er for å slippe å kode en hel database og drifte den på en ekstern server</w:t>
+      </w:r>
+    </w:p>
+    <w:p/>
+    <w:p>
+      <w:r>
+        <w:t xml:space="preserve">Visual Studio Code: VSCode er en simpel programeringsaplikasjon som er simpel å bruke med tanke på </w:t>
+      </w:r>
+      <w:r>
+        <w:t>GitHub</w:t>
+      </w:r>
+      <w:r>
+        <w:t xml:space="preserve"> du kan lett synkronisere det du har laget med </w:t>
+      </w:r>
+      <w:r>
+        <w:t>GitHub</w:t>
+      </w:r>
+      <w:r>
+        <w:t xml:space="preserve">. Jeg valgte denne siden for å gjøre det lettere </w:t>
+      </w:r>
+      <w:r>
+        <w:t xml:space="preserve">å opptattere nettsiden på en rask og </w:t>
+      </w:r>
+      <w:r>
+        <w:t>effektiv</w:t>
+      </w:r>
+      <w:r>
+        <w:t xml:space="preserve"> måte </w:t>
+      </w:r>
+    </w:p>
+    <w:p/>
+    <w:p>
+      <w:r>
+        <w:t>GitHub: GitHub er en plattform man kan bruke for å legge ut nettsidene og programmeringsprosjektene sine. Jeg bruker da GitHub for å drifte nettsiden min gratis og holde de ute for alle.</w:t>
+      </w:r>
+    </w:p>
+    <w:p/>
+    <w:p/>
+    <w:p>
+      <w:r>
+        <w:t>Mysqlworkbench: dette er en databaseprogrameringside hvor du også kan lage er-ark noe jeg har benyttet meg av for å lage da ett er-ark for å fremstille datab</w:t>
+      </w:r>
+      <w:r>
+        <w:t>a</w:t>
+      </w:r>
+      <w:r>
+        <w:t xml:space="preserve">sen min som ligger i supabase. </w:t>
+      </w:r>
+    </w:p>
+    <w:p/>
+    <w:p/>
+    <w:p/>
+    <w:p/>
+    <w:p>
+      <w:r>
+        <w:rPr>
+          <w:noProof/>
+        </w:rPr>
+        <w:drawing>
+          <wp:inline distT="0" distB="0" distL="0" distR="0" wp14:anchorId="125DF094" wp14:editId="6F416E95">
+            <wp:extent cx="5760720" cy="2980055"/>
+            <wp:effectExtent l="0" t="0" r="5080" b="4445"/>
+            <wp:docPr id="1046859174" name="Bilde 1"/>
+            <wp:cNvGraphicFramePr>
+              <a:graphicFrameLocks xmlns:a="http://schemas.openxmlformats.org/drawingml/2006/main" noChangeAspect="1"/>
+            </wp:cNvGraphicFramePr>
+            <a:graphic xmlns:a="http://schemas.openxmlformats.org/drawingml/2006/main">
+              <a:graphicData uri="http://schemas.openxmlformats.org/drawingml/2006/picture">
+                <pic:pic xmlns:pic="http://schemas.openxmlformats.org/drawingml/2006/picture">
+                  <pic:nvPicPr>
+                    <pic:cNvPr id="1046859174" name="Bilde 1046859174"/>
+                    <pic:cNvPicPr/>
+                  </pic:nvPicPr>
+                  <pic:blipFill>
+                    <a:blip r:embed="rId5" cstate="print">
+                      <a:extLst>
+                        <a:ext uri="{28A0092B-C50C-407E-A947-70E740481C1C}">
+                          <a14:useLocalDpi xmlns:a14="http://schemas.microsoft.com/office/drawing/2010/main" val="0"/>
+                        </a:ext>
+                      </a:extLst>
+                    </a:blip>
+                    <a:stretch>
+                      <a:fillRect/>
+                    </a:stretch>
+                  </pic:blipFill>
+                  <pic:spPr>
+                    <a:xfrm>
+                      <a:off x="0" y="0"/>
+                      <a:ext cx="5760720" cy="2980055"/>
+                    </a:xfrm>
+                    <a:prstGeom prst="rect">
+                      <a:avLst/>
+                    </a:prstGeom>
+                  </pic:spPr>
+                </pic:pic>
+              </a:graphicData>
+            </a:graphic>
+          </wp:inline>
+        </w:drawing>
+      </w:r>
+    </w:p>
     <w:sectPr>
       <w:pgSz w:w="11906" w:h="16838"/>
       <w:pgMar w:top="1417" w:right="1417" w:bottom="1417" w:left="1417" w:header="708" w:footer="708" w:gutter="0"/>

</xml_diff>